<commit_message>
fix: keep contract generation available when optional AI service is unavailable
</commit_message>
<xml_diff>
--- a/server/templates/farm-service.docx
+++ b/server/templates/farm-service.docx
@@ -2962,27 +2962,61 @@
       </w:tr>
     </w:tbl>
     <w:p>
+      <w:pPr>
+        <w:keepNext/>
+        <w:spacing w:line="264" w:lineRule="auto" w:after="60"/>
+      </w:pPr>
       <w:r>
+        <w:rPr>
+          <w:sz w:val="20"/>
+        </w:rPr>
         <w:t>其他服务事项及标准：{{extraStandards}}</w:t>
       </w:r>
     </w:p>
     <w:p>
+      <w:pPr>
+        <w:keepNext/>
+        <w:spacing w:line="264" w:lineRule="auto" w:after="60"/>
+      </w:pPr>
       <w:r>
+        <w:rPr>
+          <w:sz w:val="20"/>
+        </w:rPr>
         <w:t>注：1.甲乙双方根据约定选择服务事项和服务内容，也可根据实际情况增加具体服务内容。</w:t>
       </w:r>
     </w:p>
     <w:p>
+      <w:pPr>
+        <w:keepNext/>
+        <w:spacing w:line="264" w:lineRule="auto" w:after="60"/>
+      </w:pPr>
       <w:r>
+        <w:rPr>
+          <w:sz w:val="20"/>
+        </w:rPr>
         <w:t>2.本《农作物生产托管服务标准指引》一式两份，甲乙双方各执一份，附于《农业生产托管服务合同示范文本》之后，具有同等法律效力。</w:t>
       </w:r>
     </w:p>
     <w:p>
+      <w:pPr>
+        <w:keepNext/>
+        <w:spacing w:line="264" w:lineRule="auto" w:after="60"/>
+      </w:pPr>
       <w:r>
+        <w:rPr>
+          <w:sz w:val="20"/>
+        </w:rPr>
         <w:t>甲方（签字或盖章）：________________    时间：________________</w:t>
       </w:r>
     </w:p>
     <w:p>
+      <w:pPr>
+        <w:spacing w:line="264" w:lineRule="auto" w:after="60"/>
+      </w:pPr>
       <w:r>
+        <w:rPr>
+          <w:sz w:val="20"/>
+        </w:rPr>
         <w:t>乙方（签字或盖章）：________________    时间：________________</w:t>
       </w:r>
     </w:p>

</xml_diff>